<commit_message>
llena el Plan de Trabajo en el formato oficial
Tema, sustento estructurado, objetivo general y 4 objetivos especificos
volcados al .docx conservando encabezados y estilos del formato.
Los datos sin verificar quedan marcados como [DATO PENDIENTE] y
[FUENTE PENDIENTE] dentro del propio documento.

Los indicadores de exito salen del entregable: el formato no los pide.
Van al capitulo 1 (seccion Definicion de solucion), y quedan como nota de
trabajo en nota-indicadores-de-exito.md
</commit_message>
<xml_diff>
--- a/3-documento/trabajo/plan-de-trabajo-investigacion.docx
+++ b/3-documento/trabajo/plan-de-trabajo-investigacion.docx
@@ -56,178 +56,27 @@
           <w:color w:val="000000"/>
           <w:lang w:val="es-ES"/>
         </w:rPr>
-        <w:t>Tema</w:t>
-      </w:r>
-      <w:r>
-        <w:rPr>
-          <w:rFonts w:ascii="Calibri Light" w:hAnsi="Calibri Light"/>
-          <w:noProof/>
-          <w:color w:val="000000"/>
-          <w:lang w:val="es-ES"/>
-        </w:rPr>
-        <w:t xml:space="preserve">: </w:t>
+        <w:t>Tema: Sistema de gestión y priorización de prospectos de aporte con segmentación analítica para museos privados sin fines de lucro</w:t>
       </w:r>
     </w:p>
     <w:p>
-      <w:pPr>
-        <w:rPr>
-          <w:rFonts w:ascii="Calibri" w:hAnsi="Calibri" w:eastAsia="Times New Roman" w:cs="Times New Roman"/>
-          <w:color w:val="222222"/>
-          <w:lang w:val="es-PE" w:eastAsia="es-PE"/>
-        </w:rPr>
-      </w:pPr>
       <w:r>
-        <w:rPr>
-          <w:rFonts w:ascii="Calibri" w:hAnsi="Calibri" w:eastAsia="Times New Roman" w:cs="Times New Roman"/>
-          <w:color w:val="222222"/>
-          <w:lang w:val="es-PE" w:eastAsia="es-PE"/>
-        </w:rPr>
-        <w:t>La esencia del Tema es el problema</w:t>
-      </w:r>
-      <w:r>
-        <w:rPr>
-          <w:rFonts w:ascii="Calibri" w:hAnsi="Calibri" w:eastAsia="Times New Roman" w:cs="Times New Roman"/>
-          <w:color w:val="222222"/>
-          <w:lang w:val="es-PE" w:eastAsia="es-PE"/>
-        </w:rPr>
-        <w:t xml:space="preserve"> </w:t>
-      </w:r>
-      <w:r>
-        <w:rPr>
-          <w:rFonts w:ascii="Calibri" w:hAnsi="Calibri" w:eastAsia="Times New Roman" w:cs="Times New Roman"/>
-          <w:color w:val="222222"/>
-          <w:lang w:val="es-PE" w:eastAsia="es-PE"/>
-        </w:rPr>
-        <w:t>y que se pretende hacer para resolverlo</w:t>
-      </w:r>
-      <w:r>
-        <w:rPr>
-          <w:rFonts w:ascii="Calibri" w:hAnsi="Calibri" w:eastAsia="Times New Roman" w:cs="Times New Roman"/>
-          <w:color w:val="222222"/>
-          <w:lang w:val="es-PE" w:eastAsia="es-PE"/>
-        </w:rPr>
-        <w:t xml:space="preserve"> </w:t>
-      </w:r>
-      <w:r>
-        <w:rPr>
-          <w:rFonts w:ascii="Calibri" w:hAnsi="Calibri" w:eastAsia="Times New Roman" w:cs="Times New Roman"/>
-          <w:color w:val="222222"/>
-          <w:lang w:val="es-PE" w:eastAsia="es-PE"/>
-        </w:rPr>
-        <w:t>(aporte)</w:t>
+        <w:t>El proyecto propone un sistema de gestión de donantes que incorpora un modelo de segmentación analítica para identificar y priorizar, dentro de la base de miembros de un museo, a quienes tienen mayor potencial de convertirse en aportantes económicos, y para dar trazabilidad al ciclo completo del aporte.</w:t>
       </w:r>
     </w:p>
     <w:p>
-      <w:pPr>
-        <w:rPr>
-          <w:rFonts w:ascii="Calibri" w:hAnsi="Calibri" w:eastAsia="Times New Roman" w:cs="Times New Roman"/>
-          <w:color w:val="222222"/>
-          <w:lang w:val="es-PE" w:eastAsia="es-PE"/>
-        </w:rPr>
-      </w:pPr>
       <w:r>
-        <w:rPr>
-          <w:rFonts w:ascii="Calibri" w:hAnsi="Calibri" w:eastAsia="Times New Roman" w:cs="Times New Roman"/>
-          <w:color w:val="222222"/>
-          <w:lang w:val="es-PE" w:eastAsia="es-PE"/>
-        </w:rPr>
-        <w:t xml:space="preserve">La descripción debe contener: </w:t>
+        <w:t>El problema que resuelve es la baja conversión de miembros no aportantes en aportantes y la gestión manual y sin trazabilidad de los aportes, comprobantes y credenciales, en instituciones que dependen críticamente de las donaciones porque sus ingresos por taquilla no cubren sus costos de operación.</w:t>
       </w:r>
+    </w:p>
+    <w:p>
       <w:r>
-        <w:rPr>
-          <w:rFonts w:ascii="Calibri" w:hAnsi="Calibri" w:eastAsia="Times New Roman" w:cs="Times New Roman"/>
-          <w:color w:val="222222"/>
-          <w:lang w:val="es-PE" w:eastAsia="es-PE"/>
-        </w:rPr>
-        <w:t>Cuál</w:t>
+        <w:t>La técnica de tecnologías de información aplicada es la analítica de datos con segmentación no supervisada, enriquecida con fuentes de datos públicas, siguiendo el método CRISP-DM, e implementada dentro de un sistema de gestión.</w:t>
       </w:r>
+    </w:p>
+    <w:p>
       <w:r>
-        <w:rPr>
-          <w:rFonts w:ascii="Calibri" w:hAnsi="Calibri" w:eastAsia="Times New Roman" w:cs="Times New Roman"/>
-          <w:color w:val="222222"/>
-          <w:lang w:val="es-PE" w:eastAsia="es-PE"/>
-        </w:rPr>
-        <w:t xml:space="preserve"> será el </w:t>
-      </w:r>
-      <w:r>
-        <w:rPr>
-          <w:rFonts w:ascii="Calibri" w:hAnsi="Calibri" w:eastAsia="Times New Roman" w:cs="Times New Roman"/>
-          <w:b/>
-          <w:bCs/>
-          <w:color w:val="222222"/>
-          <w:lang w:val="es-PE" w:eastAsia="es-PE"/>
-        </w:rPr>
-        <w:t>aporte</w:t>
-      </w:r>
-      <w:r>
-        <w:rPr>
-          <w:rFonts w:ascii="Calibri" w:hAnsi="Calibri" w:eastAsia="Times New Roman" w:cs="Times New Roman"/>
-          <w:color w:val="222222"/>
-          <w:lang w:val="es-PE" w:eastAsia="es-PE"/>
-        </w:rPr>
-        <w:t xml:space="preserve"> de la propuesta para solucionar un </w:t>
-      </w:r>
-      <w:r>
-        <w:rPr>
-          <w:rFonts w:ascii="Calibri" w:hAnsi="Calibri" w:eastAsia="Times New Roman" w:cs="Times New Roman"/>
-          <w:b/>
-          <w:bCs/>
-          <w:color w:val="222222"/>
-          <w:lang w:val="es-PE" w:eastAsia="es-PE"/>
-        </w:rPr>
-        <w:t>problema</w:t>
-      </w:r>
-      <w:r>
-        <w:rPr>
-          <w:rFonts w:ascii="Calibri" w:hAnsi="Calibri" w:eastAsia="Times New Roman" w:cs="Times New Roman"/>
-          <w:color w:val="222222"/>
-          <w:lang w:val="es-PE" w:eastAsia="es-PE"/>
-        </w:rPr>
-        <w:t xml:space="preserve"> de un </w:t>
-      </w:r>
-      <w:r>
-        <w:rPr>
-          <w:rFonts w:ascii="Calibri" w:hAnsi="Calibri" w:eastAsia="Times New Roman" w:cs="Times New Roman"/>
-          <w:b/>
-          <w:bCs/>
-          <w:color w:val="222222"/>
-          <w:lang w:val="es-PE" w:eastAsia="es-PE"/>
-        </w:rPr>
-        <w:t>escenario</w:t>
-      </w:r>
-      <w:r>
-        <w:rPr>
-          <w:rFonts w:ascii="Calibri" w:hAnsi="Calibri" w:eastAsia="Times New Roman" w:cs="Times New Roman"/>
-          <w:color w:val="222222"/>
-          <w:lang w:val="es-PE" w:eastAsia="es-PE"/>
-        </w:rPr>
-        <w:t xml:space="preserve"> (institución) mediante el uso de </w:t>
-      </w:r>
-      <w:r>
-        <w:rPr>
-          <w:rFonts w:ascii="Calibri" w:hAnsi="Calibri" w:eastAsia="Times New Roman" w:cs="Times New Roman"/>
-          <w:b/>
-          <w:bCs/>
-          <w:color w:val="222222"/>
-          <w:lang w:val="es-PE" w:eastAsia="es-PE"/>
-        </w:rPr>
-        <w:t>técnicas o herramientas</w:t>
-      </w:r>
-      <w:r>
-        <w:rPr>
-          <w:rFonts w:ascii="Calibri" w:hAnsi="Calibri" w:eastAsia="Times New Roman" w:cs="Times New Roman"/>
-          <w:color w:val="222222"/>
-          <w:lang w:val="es-PE" w:eastAsia="es-PE"/>
-        </w:rPr>
-        <w:t xml:space="preserve"> de TI</w:t>
-      </w:r>
-      <w:r>
-        <w:rPr>
-          <w:rFonts w:ascii="Calibri" w:hAnsi="Calibri" w:eastAsia="Times New Roman" w:cs="Times New Roman"/>
-          <w:color w:val="222222"/>
-          <w:lang w:val="es-PE" w:eastAsia="es-PE"/>
-        </w:rPr>
-        <w:t>.</w:t>
+        <w:t>El escenario de validación es el Museo de Arte Contemporáneo de Lima (MAC), museo privado sin fines de lucro, a través de su programa Amigos del MAC.</w:t>
       </w:r>
     </w:p>
     <w:p>
@@ -251,346 +100,33 @@
       </w:r>
     </w:p>
     <w:p>
-      <w:pPr>
-        <w:rPr>
-          <w:rFonts w:ascii="Calibri" w:hAnsi="Calibri" w:eastAsia="Times New Roman" w:cs="Times New Roman"/>
-          <w:color w:val="222222"/>
-          <w:lang w:val="es-PE" w:eastAsia="es-PE"/>
-        </w:rPr>
-      </w:pPr>
       <w:r>
-        <w:rPr>
-          <w:rFonts w:ascii="Calibri" w:hAnsi="Calibri" w:eastAsia="Times New Roman" w:cs="Times New Roman"/>
-          <w:color w:val="222222"/>
-          <w:lang w:val="es-PE" w:eastAsia="es-PE"/>
-        </w:rPr>
-        <w:t xml:space="preserve">Las razones </w:t>
-      </w:r>
-      <w:r>
-        <w:rPr>
-          <w:rFonts w:ascii="Calibri" w:hAnsi="Calibri" w:eastAsia="Times New Roman" w:cs="Times New Roman"/>
-          <w:color w:val="222222"/>
-          <w:lang w:val="es-PE" w:eastAsia="es-PE"/>
-        </w:rPr>
-        <w:t xml:space="preserve">cualitativas y/o cuantitativas </w:t>
-      </w:r>
-      <w:r>
-        <w:rPr>
-          <w:rFonts w:ascii="Calibri" w:hAnsi="Calibri" w:eastAsia="Times New Roman" w:cs="Times New Roman"/>
-          <w:color w:val="222222"/>
-          <w:lang w:val="es-PE" w:eastAsia="es-PE"/>
-        </w:rPr>
-        <w:t>que ameritan el trabajo</w:t>
-      </w:r>
-      <w:r>
-        <w:rPr>
-          <w:rFonts w:ascii="Calibri" w:hAnsi="Calibri" w:eastAsia="Times New Roman" w:cs="Times New Roman"/>
-          <w:color w:val="222222"/>
-          <w:lang w:val="es-PE" w:eastAsia="es-PE"/>
-        </w:rPr>
-        <w:t xml:space="preserve">. </w:t>
+        <w:t>El escenario depende de las donaciones para existir. Los ingresos por venta de entradas del MAC cubren menos del [DATO PENDIENTE] % del costo de operación del museo. [FUENTE PENDIENTE]</w:t>
       </w:r>
     </w:p>
     <w:p>
-      <w:pPr>
-        <w:rPr>
-          <w:rFonts w:ascii="Calibri" w:hAnsi="Calibri" w:eastAsia="Times New Roman" w:cs="Times New Roman"/>
-          <w:color w:val="222222"/>
-          <w:lang w:val="es-PE" w:eastAsia="es-PE"/>
-        </w:rPr>
-      </w:pPr>
       <w:r>
-        <w:rPr>
-          <w:rFonts w:ascii="Calibri" w:hAnsi="Calibri" w:eastAsia="Times New Roman" w:cs="Times New Roman"/>
-          <w:color w:val="222222"/>
-          <w:lang w:val="es-PE" w:eastAsia="es-PE"/>
-        </w:rPr>
-        <w:t xml:space="preserve">En el sustento </w:t>
-      </w:r>
-      <w:r>
-        <w:rPr>
-          <w:rFonts w:ascii="Calibri" w:hAnsi="Calibri" w:eastAsia="Times New Roman" w:cs="Times New Roman"/>
-          <w:color w:val="222222"/>
-          <w:lang w:val="es-PE" w:eastAsia="es-PE"/>
-        </w:rPr>
-        <w:t xml:space="preserve">se </w:t>
-      </w:r>
-      <w:r>
-        <w:rPr>
-          <w:rFonts w:ascii="Calibri" w:hAnsi="Calibri" w:eastAsia="Times New Roman" w:cs="Times New Roman"/>
-          <w:color w:val="222222"/>
-          <w:lang w:val="es-PE" w:eastAsia="es-PE"/>
-        </w:rPr>
-        <w:t>debe considerar información estadística de fuentes válidas y confiables pudiendo ser: tesis, libros, artículos académicos, artículos científicos, revistas de la especialidad, diarios nacionales o internacionales, informes gubernamentales</w:t>
-      </w:r>
-      <w:r>
-        <w:rPr>
-          <w:rFonts w:ascii="Calibri" w:hAnsi="Calibri" w:eastAsia="Times New Roman" w:cs="Times New Roman"/>
-          <w:color w:val="222222"/>
-          <w:lang w:val="es-PE" w:eastAsia="es-PE"/>
-        </w:rPr>
-        <w:t>, informes de instituciones tecnológicas confiables.</w:t>
-      </w:r>
-      <w:r>
-        <w:rPr>
-          <w:rFonts w:ascii="Calibri" w:hAnsi="Calibri" w:eastAsia="Times New Roman" w:cs="Times New Roman"/>
-          <w:color w:val="222222"/>
-          <w:lang w:val="es-PE" w:eastAsia="es-PE"/>
-        </w:rPr>
-        <w:t xml:space="preserve"> Citar las fuentes.</w:t>
+        <w:t>La base de conversión está prácticamente inactiva. El programa Amigos del MAC cuenta con 1 080 miembros sin aporte económico frente a 30 miembros aportantes (25 personas naturales y 5 organizaciones). Desde 2023, un solo miembro no aportante se ha convertido en aportante, lo que representa una tasa de conversión histórica de 0,09 %. [FUENTE PENDIENTE]</w:t>
       </w:r>
     </w:p>
     <w:p>
-      <w:pPr>
-        <w:rPr>
-          <w:rFonts w:ascii="Calibri" w:hAnsi="Calibri" w:eastAsia="Times New Roman" w:cs="Times New Roman"/>
-          <w:color w:val="222222"/>
-          <w:lang w:val="es-PE" w:eastAsia="es-PE"/>
-        </w:rPr>
-      </w:pPr>
       <w:r>
-        <w:rPr>
-          <w:rFonts w:ascii="Calibri" w:hAnsi="Calibri" w:eastAsia="Times New Roman" w:cs="Times New Roman"/>
-          <w:color w:val="222222"/>
-          <w:lang w:val="es-PE" w:eastAsia="es-PE"/>
-        </w:rPr>
-        <w:t>Tener en cuenta los siguientes criterios para la consideración de las fuentes:</w:t>
+        <w:t>La gestión es manual y sin trazabilidad. El registro de miembros, los aportes, los comprobantes de pago y las credenciales se administran por correo electrónico, sin sistema. La emisión de una credencial digital toma 2 días y se elabora manualmente. Ni el museo ni el aportante tienen certeza documentada de la fecha de pago. [FUENTE PENDIENTE]</w:t>
       </w:r>
     </w:p>
     <w:p>
-      <w:pPr>
-        <w:rPr>
-          <w:rFonts w:ascii="Calibri" w:hAnsi="Calibri" w:eastAsia="Times New Roman" w:cs="Times New Roman"/>
-          <w:color w:val="222222"/>
-          <w:lang w:val="es-PE" w:eastAsia="es-PE"/>
-        </w:rPr>
-      </w:pPr>
       <w:r>
-        <w:rPr>
-          <w:rFonts w:ascii="Calibri" w:hAnsi="Calibri" w:eastAsia="Times New Roman" w:cs="Times New Roman"/>
-          <w:color w:val="222222"/>
-          <w:lang w:val="es-PE" w:eastAsia="es-PE"/>
-        </w:rPr>
-        <w:t>Tesis, Libros o Artículos Académicos</w:t>
-      </w:r>
-      <w:r>
-        <w:rPr>
-          <w:rFonts w:ascii="Calibri" w:hAnsi="Calibri" w:eastAsia="Times New Roman" w:cs="Times New Roman"/>
-          <w:color w:val="222222"/>
-          <w:lang w:val="es-PE" w:eastAsia="es-PE"/>
-        </w:rPr>
-        <w:t>, Informes</w:t>
-      </w:r>
-      <w:r>
-        <w:rPr>
-          <w:rFonts w:ascii="Calibri" w:hAnsi="Calibri" w:eastAsia="Times New Roman" w:cs="Times New Roman"/>
-          <w:color w:val="222222"/>
-          <w:lang w:val="es-PE" w:eastAsia="es-PE"/>
-        </w:rPr>
-        <w:t>:</w:t>
+        <w:t>El problema no es exclusivo del escenario. [DATO PENDIENTE: evidencia sectorial sobre dependencia de donaciones en museos] [DATO PENDIENTE: evidencia sobre tasas de retención y conversión de donantes] [FUENTE PENDIENTE]</w:t>
       </w:r>
     </w:p>
     <w:p>
-      <w:pPr>
-        <w:pStyle w:val="Prrafodelista"/>
-        <w:numPr>
-          <w:ilvl w:val="0"/>
-          <w:numId w:val="20"/>
-        </w:numPr>
-        <w:rPr>
-          <w:rFonts w:ascii="Calibri" w:hAnsi="Calibri" w:eastAsia="Times New Roman" w:cs="Times New Roman"/>
-          <w:color w:val="222222"/>
-          <w:lang w:val="es-PE" w:eastAsia="es-PE"/>
-        </w:rPr>
-      </w:pPr>
       <w:r>
-        <w:rPr>
-          <w:rFonts w:ascii="Calibri" w:hAnsi="Calibri" w:eastAsia="Times New Roman" w:cs="Times New Roman"/>
-          <w:color w:val="222222"/>
-          <w:lang w:val="es-PE" w:eastAsia="es-PE"/>
-        </w:rPr>
-        <w:t xml:space="preserve">Antigüedad: No mayor a </w:t>
-      </w:r>
-      <w:r>
-        <w:rPr>
-          <w:rFonts w:ascii="Calibri" w:hAnsi="Calibri" w:eastAsia="Times New Roman" w:cs="Times New Roman"/>
-          <w:color w:val="222222"/>
-          <w:lang w:val="es-PE" w:eastAsia="es-PE"/>
-        </w:rPr>
-        <w:t>cinco</w:t>
-      </w:r>
-      <w:r>
-        <w:rPr>
-          <w:rFonts w:ascii="Calibri" w:hAnsi="Calibri" w:eastAsia="Times New Roman" w:cs="Times New Roman"/>
-          <w:color w:val="222222"/>
-          <w:lang w:val="es-PE" w:eastAsia="es-PE"/>
-        </w:rPr>
-        <w:t xml:space="preserve"> (0</w:t>
-      </w:r>
-      <w:r>
-        <w:rPr>
-          <w:rFonts w:ascii="Calibri" w:hAnsi="Calibri" w:eastAsia="Times New Roman" w:cs="Times New Roman"/>
-          <w:color w:val="222222"/>
-          <w:lang w:val="es-PE" w:eastAsia="es-PE"/>
-        </w:rPr>
-        <w:t>5</w:t>
-      </w:r>
-      <w:r>
-        <w:rPr>
-          <w:rFonts w:ascii="Calibri" w:hAnsi="Calibri" w:eastAsia="Times New Roman" w:cs="Times New Roman"/>
-          <w:color w:val="222222"/>
-          <w:lang w:val="es-PE" w:eastAsia="es-PE"/>
-        </w:rPr>
-        <w:t>) años.</w:t>
+        <w:t>La solución beneficia al museo, que podría sostener y ampliar su programación cultural y educativa; a los aportantes, que hoy carecen de constancia y seguimiento de su aporte; al público beneficiario de esa programación; y a otros museos privados sin fines de lucro que presentan el mismo problema.</w:t>
       </w:r>
     </w:p>
     <w:p>
-      <w:pPr>
-        <w:pStyle w:val="Prrafodelista"/>
-        <w:numPr>
-          <w:ilvl w:val="0"/>
-          <w:numId w:val="20"/>
-        </w:numPr>
-        <w:rPr>
-          <w:rFonts w:ascii="Calibri" w:hAnsi="Calibri" w:eastAsia="Times New Roman" w:cs="Times New Roman"/>
-          <w:color w:val="222222"/>
-          <w:lang w:val="es-PE" w:eastAsia="es-PE"/>
-        </w:rPr>
-      </w:pPr>
       <w:r>
-        <w:rPr>
-          <w:rFonts w:ascii="Calibri" w:hAnsi="Calibri" w:eastAsia="Times New Roman" w:cs="Times New Roman"/>
-          <w:color w:val="222222"/>
-          <w:lang w:val="es-PE" w:eastAsia="es-PE"/>
-        </w:rPr>
-        <w:t>Idioma: De preferencia en inglés.</w:t>
-      </w:r>
-    </w:p>
-    <w:p>
-      <w:pPr>
-        <w:rPr>
-          <w:rFonts w:ascii="Calibri" w:hAnsi="Calibri" w:eastAsia="Times New Roman" w:cs="Times New Roman"/>
-          <w:color w:val="222222"/>
-          <w:lang w:val="es-PE" w:eastAsia="es-PE"/>
-        </w:rPr>
-      </w:pPr>
-      <w:r>
-        <w:rPr>
-          <w:rFonts w:ascii="Calibri" w:hAnsi="Calibri" w:eastAsia="Times New Roman" w:cs="Times New Roman"/>
-          <w:color w:val="222222"/>
-          <w:lang w:val="es-PE" w:eastAsia="es-PE"/>
-        </w:rPr>
-        <w:t>Artículos Científicos:</w:t>
-      </w:r>
-    </w:p>
-    <w:p>
-      <w:pPr>
-        <w:pStyle w:val="Prrafodelista"/>
-        <w:numPr>
-          <w:ilvl w:val="0"/>
-          <w:numId w:val="20"/>
-        </w:numPr>
-        <w:rPr>
-          <w:rFonts w:ascii="Calibri" w:hAnsi="Calibri" w:eastAsia="Times New Roman" w:cs="Times New Roman"/>
-          <w:color w:val="222222"/>
-          <w:lang w:val="es-PE" w:eastAsia="es-PE"/>
-        </w:rPr>
-      </w:pPr>
-      <w:r>
-        <w:rPr>
-          <w:rFonts w:ascii="Calibri" w:hAnsi="Calibri" w:eastAsia="Times New Roman" w:cs="Times New Roman"/>
-          <w:color w:val="222222"/>
-          <w:lang w:val="es-PE" w:eastAsia="es-PE"/>
-        </w:rPr>
-        <w:t>Antigüedad: No mayor a tres (03) años.</w:t>
-      </w:r>
-    </w:p>
-    <w:p>
-      <w:pPr>
-        <w:pStyle w:val="Prrafodelista"/>
-        <w:numPr>
-          <w:ilvl w:val="0"/>
-          <w:numId w:val="20"/>
-        </w:numPr>
-        <w:rPr>
-          <w:rFonts w:ascii="Calibri" w:hAnsi="Calibri" w:eastAsia="Times New Roman" w:cs="Times New Roman"/>
-          <w:color w:val="222222"/>
-          <w:lang w:val="es-PE" w:eastAsia="es-PE"/>
-        </w:rPr>
-      </w:pPr>
-      <w:r>
-        <w:rPr>
-          <w:rFonts w:ascii="Calibri" w:hAnsi="Calibri" w:eastAsia="Times New Roman" w:cs="Times New Roman"/>
-          <w:color w:val="222222"/>
-          <w:lang w:val="es-PE" w:eastAsia="es-PE"/>
-        </w:rPr>
-        <w:t>Idioma: De preferencia artículos en inglés.</w:t>
-      </w:r>
-    </w:p>
-    <w:p>
-      <w:pPr>
-        <w:pStyle w:val="Prrafodelista"/>
-        <w:numPr>
-          <w:ilvl w:val="0"/>
-          <w:numId w:val="20"/>
-        </w:numPr>
-        <w:rPr>
-          <w:rFonts w:ascii="Calibri" w:hAnsi="Calibri" w:eastAsia="Times New Roman" w:cs="Times New Roman"/>
-          <w:color w:val="222222"/>
-          <w:lang w:val="es-PE" w:eastAsia="es-PE"/>
-        </w:rPr>
-      </w:pPr>
-      <w:r>
-        <w:rPr>
-          <w:rFonts w:ascii="Calibri" w:hAnsi="Calibri" w:eastAsia="Times New Roman" w:cs="Times New Roman"/>
-          <w:color w:val="222222"/>
-          <w:lang w:val="es-PE" w:eastAsia="es-PE"/>
-        </w:rPr>
-        <w:t>Tipo de Artículo: Aporte (No revisiones, conferencias, congresos, resúmenes, entre otros tipos de artículos)</w:t>
-      </w:r>
-    </w:p>
-    <w:p>
-      <w:pPr>
-        <w:pStyle w:val="Prrafodelista"/>
-        <w:numPr>
-          <w:ilvl w:val="0"/>
-          <w:numId w:val="20"/>
-        </w:numPr>
-        <w:rPr>
-          <w:rFonts w:ascii="Calibri" w:hAnsi="Calibri" w:eastAsia="Times New Roman" w:cs="Times New Roman"/>
-          <w:color w:val="222222"/>
-          <w:lang w:val="es-PE" w:eastAsia="es-PE"/>
-        </w:rPr>
-      </w:pPr>
-      <w:r>
-        <w:rPr>
-          <w:rFonts w:ascii="Calibri" w:hAnsi="Calibri" w:eastAsia="Times New Roman" w:cs="Times New Roman"/>
-          <w:color w:val="222222"/>
-          <w:lang w:val="es-PE" w:eastAsia="es-PE"/>
-        </w:rPr>
-        <w:t>Publicación: En revista indexada.</w:t>
-      </w:r>
-    </w:p>
-    <w:p>
-      <w:pPr>
-        <w:pStyle w:val="Prrafodelista"/>
-        <w:numPr>
-          <w:ilvl w:val="0"/>
-          <w:numId w:val="20"/>
-        </w:numPr>
-        <w:rPr>
-          <w:rFonts w:ascii="Calibri" w:hAnsi="Calibri"/>
-          <w:noProof/>
-          <w:lang w:val="es-PE"/>
-        </w:rPr>
-      </w:pPr>
-      <w:r>
-        <w:rPr>
-          <w:rFonts w:ascii="Calibri" w:hAnsi="Calibri" w:eastAsia="Times New Roman" w:cs="Times New Roman"/>
-          <w:color w:val="222222"/>
-          <w:lang w:val="es-PE" w:eastAsia="es-PE"/>
-        </w:rPr>
-        <w:t>Cuartil: Q1 o Q2</w:t>
+        <w:t>[PENDIENTE: argumentar con literatura por qué las soluciones comerciales existentes no resuelven el problema]</w:t>
       </w:r>
     </w:p>
     <w:p>
@@ -612,77 +148,8 @@
       </w:r>
     </w:p>
     <w:p>
-      <w:pPr>
-        <w:rPr>
-          <w:rFonts w:ascii="Calibri" w:hAnsi="Calibri"/>
-          <w:noProof/>
-          <w:lang w:val="es-ES"/>
-        </w:rPr>
-      </w:pPr>
       <w:r>
-        <w:rPr>
-          <w:rFonts w:ascii="Calibri" w:hAnsi="Calibri"/>
-          <w:noProof/>
-          <w:lang w:val="es-ES"/>
-        </w:rPr>
-        <w:t xml:space="preserve">Se debe proponer en forma preliminar en un </w:t>
-      </w:r>
-      <w:r>
-        <w:rPr>
-          <w:rFonts w:ascii="Calibri" w:hAnsi="Calibri"/>
-          <w:noProof/>
-          <w:lang w:val="es-ES"/>
-        </w:rPr>
-        <w:t>párrafo</w:t>
-      </w:r>
-      <w:r>
-        <w:rPr>
-          <w:rFonts w:ascii="Calibri" w:hAnsi="Calibri"/>
-          <w:noProof/>
-          <w:lang w:val="es-ES"/>
-        </w:rPr>
-        <w:t xml:space="preserve"> breve, que se obtendrá a</w:t>
-      </w:r>
-      <w:r>
-        <w:rPr>
-          <w:rFonts w:ascii="Calibri" w:hAnsi="Calibri"/>
-          <w:noProof/>
-          <w:lang w:val="es-ES"/>
-        </w:rPr>
-        <w:t xml:space="preserve">l finalizar </w:t>
-      </w:r>
-      <w:r>
-        <w:rPr>
-          <w:rFonts w:ascii="Calibri" w:hAnsi="Calibri"/>
-          <w:noProof/>
-          <w:lang w:val="es-ES"/>
-        </w:rPr>
-        <w:t>el proyecto de investigación aplicada para la titulación</w:t>
-      </w:r>
-      <w:r>
-        <w:rPr>
-          <w:rFonts w:ascii="Calibri" w:hAnsi="Calibri"/>
-          <w:noProof/>
-          <w:lang w:val="es-ES"/>
-        </w:rPr>
-        <w:t>.</w:t>
-      </w:r>
-    </w:p>
-    <w:p>
-      <w:pPr>
-        <w:rPr>
-          <w:rFonts w:ascii="Calibri" w:hAnsi="Calibri"/>
-          <w:noProof/>
-          <w:lang w:val="es-ES"/>
-        </w:rPr>
-      </w:pPr>
-      <w:r>
-        <w:rPr>
-          <w:rFonts w:ascii="Calibri" w:hAnsi="Calibri"/>
-          <w:noProof/>
-          <w:lang w:val="es-ES"/>
-        </w:rPr>
-        <w:t xml:space="preserve">La redacción debe iniciar con un verbo, usualmente sobre obtener un logro (aporte), incluyendo el problema principal a resolver de un escenario determinado, que se espera obtener usando alguna técnica o herramienta en la solución que se propone lograr. </w:t>
+        <w:t>Implementar un sistema de gestión y priorización de prospectos de aporte basado en segmentación analítica para la captación y fidelización de donantes en museos privados sin fines de lucro, a fin de incrementar la conversión de miembros no aportantes y reducir el tiempo de gestión administrativa del aporte.</w:t>
       </w:r>
     </w:p>
     <w:p>
@@ -708,28 +175,34 @@
     </w:p>
     <w:p>
       <w:pPr>
-        <w:rPr>
-          <w:lang w:val="es-ES"/>
-        </w:rPr>
-      </w:pPr>
+        <w:pStyle w:val="Prrafodelista"/>
+      </w:pPr>
+      <w:r>
+        <w:t>Determinar el diagnóstico de la situación actual del proceso de gestión de miembros, aportes y credenciales, mediante el análisis de los registros y flujos vigentes del museo.</w:t>
+      </w:r>
     </w:p>
     <w:p>
       <w:pPr>
-        <w:rPr>
-          <w:lang w:val="es-ES"/>
-        </w:rPr>
+        <w:pStyle w:val="Prrafodelista"/>
       </w:pPr>
       <w:r>
-        <w:rPr>
-          <w:lang w:val="es-ES"/>
-        </w:rPr>
-        <w:t>Identifique como se hará evidente que el logro se habrá obtenido</w:t>
+        <w:t>Diseñar el modelo de segmentación de miembros y la arquitectura del sistema de gestión y priorización de prospectos de aporte.</w:t>
       </w:r>
+    </w:p>
+    <w:p>
+      <w:pPr>
+        <w:pStyle w:val="Prrafodelista"/>
+      </w:pPr>
       <w:r>
-        <w:rPr>
-          <w:lang w:val="es-ES"/>
-        </w:rPr>
-        <w:t>, de preferencia en la secuencia de logros parciales en el proceso de elaboración de la solución propuesta.</w:t>
+        <w:t>Elaborar el sistema de gestión y priorización aplicando el modelo de segmentación sobre la base de miembros del escenario.</w:t>
+      </w:r>
+    </w:p>
+    <w:p>
+      <w:pPr>
+        <w:pStyle w:val="Prrafodelista"/>
+      </w:pPr>
+      <w:r>
+        <w:t>Verificar el cumplimiento de los indicadores de éxito mediante la validación de la solución en un escenario real.</w:t>
       </w:r>
     </w:p>
     <w:p>
@@ -751,29 +224,8 @@
       </w:r>
     </w:p>
     <w:p>
-      <w:pPr>
-        <w:rPr>
-          <w:rFonts w:ascii="Calibri" w:hAnsi="Calibri" w:eastAsia="Times New Roman" w:cs="Times New Roman"/>
-          <w:color w:val="222222"/>
-          <w:lang w:val="es-PE" w:eastAsia="es-PE"/>
-        </w:rPr>
-      </w:pPr>
-    </w:p>
-    <w:p>
-      <w:pPr>
-        <w:rPr>
-          <w:rFonts w:ascii="Calibri" w:hAnsi="Calibri" w:eastAsia="Times New Roman" w:cs="Times New Roman"/>
-          <w:color w:val="222222"/>
-          <w:lang w:val="es-PE" w:eastAsia="es-PE"/>
-        </w:rPr>
-      </w:pPr>
       <w:r>
-        <w:rPr>
-          <w:rFonts w:ascii="Calibri" w:hAnsi="Calibri" w:eastAsia="Times New Roman" w:cs="Times New Roman"/>
-          <w:color w:val="222222"/>
-          <w:lang w:val="es-PE" w:eastAsia="es-PE"/>
-        </w:rPr>
-        <w:t>Lista de fuentes utilizadas en la redacción del presente documento. Utilizar norma APA para las citas y referencias bibliográficas.</w:t>
+        <w:t>[PENDIENTE: se completan al cerrar el sustento. Norma APA-7.]</w:t>
       </w:r>
     </w:p>
     <w:sectPr>

</xml_diff>